<commit_message>
Formatting overhaul: headings, tab stops, People character style, template fix
- Fix {{SERVICE_TIME}} placeholder mismatch (template uses underscore)
- Change Heading 1 to Gill Sans Nova Bold (was SemiBold), strip theme-font
  attributes from built-in styles so Gill Sans Nova takes effect over Calibri
- Add tab stops to Body style: left at 1.5" (dialogue labels), right at 6"
  (hymnal references right-aligned to margin)
- Create "People" character style (bold) replacing old "Body - People"
  paragraph style; consolidate "Body - Celebrant" and "Body - People" into
  single "Body - Dialogue" paragraph style with hanging indent at 1.5"
- Update People Recitation styles to use character-level bold via People style
- Refactor hymn header to right-align hymnal ref using single right tab

Co-Authored-By: Claude Opus 4.6 <noreply@anthropic.com>
</commit_message>
<xml_diff>
--- a/templates/front_cover.docx
+++ b/templates/front_cover.docx
@@ -208,7 +208,29 @@
                                 <w:sz w:val="24"/>
                                 <w:szCs w:val="24"/>
                               </w:rPr>
-                              <w:t>{{TIME}}</w:t>
+                              <w:t>{{</w:t>
+                            </w:r>
+                            <w:r>
+                              <w:rPr>
+                                <w:rFonts w:ascii="Gill Sans Nova Book" w:hAnsi="Gill Sans Nova Book"/>
+                                <w:b/>
+                                <w:bCs/>
+                                <w:color w:val="FFFFFF" w:themeColor="background1"/>
+                                <w:sz w:val="24"/>
+                                <w:szCs w:val="24"/>
+                              </w:rPr>
+                              <w:t>SERVICE_</w:t>
+                            </w:r>
+                            <w:r>
+                              <w:rPr>
+                                <w:rFonts w:ascii="Gill Sans Nova Book" w:hAnsi="Gill Sans Nova Book"/>
+                                <w:b/>
+                                <w:bCs/>
+                                <w:color w:val="FFFFFF" w:themeColor="background1"/>
+                                <w:sz w:val="24"/>
+                                <w:szCs w:val="24"/>
+                              </w:rPr>
+                              <w:t>TIME}}</w:t>
                             </w:r>
                           </w:p>
                         </w:txbxContent>
@@ -304,7 +326,29 @@
                           <w:sz w:val="24"/>
                           <w:szCs w:val="24"/>
                         </w:rPr>
-                        <w:t>{{TIME}}</w:t>
+                        <w:t>{{</w:t>
+                      </w:r>
+                      <w:r>
+                        <w:rPr>
+                          <w:rFonts w:ascii="Gill Sans Nova Book" w:hAnsi="Gill Sans Nova Book"/>
+                          <w:b/>
+                          <w:bCs/>
+                          <w:color w:val="FFFFFF" w:themeColor="background1"/>
+                          <w:sz w:val="24"/>
+                          <w:szCs w:val="24"/>
+                        </w:rPr>
+                        <w:t>SERVICE_</w:t>
+                      </w:r>
+                      <w:r>
+                        <w:rPr>
+                          <w:rFonts w:ascii="Gill Sans Nova Book" w:hAnsi="Gill Sans Nova Book"/>
+                          <w:b/>
+                          <w:bCs/>
+                          <w:color w:val="FFFFFF" w:themeColor="background1"/>
+                          <w:sz w:val="24"/>
+                          <w:szCs w:val="24"/>
+                        </w:rPr>
+                        <w:t>TIME}}</w:t>
                       </w:r>
                     </w:p>
                   </w:txbxContent>

</xml_diff>